<commit_message>
sesion 13 banco pruebas
</commit_message>
<xml_diff>
--- a/doc/GUÍA DE PRÁCTICA.docx
+++ b/doc/GUÍA DE PRÁCTICA.docx
@@ -16,54 +16,56 @@
           <w:sz w:val="32"/>
           <w:lang w:val="es-ES"/>
         </w:rPr>
-        <w:t>GUÍA DE PRÁCTICA – SESIÓN 12</w:t>
+        <w:t>GUÍA DE PRÁCTICA – SESIÓN 13</w:t>
       </w:r>
     </w:p>
     <w:p>
       <w:pPr>
         <w:jc w:val="center"/>
         <w:rPr>
+          <w:b/>
+          <w:color w:val="1F4E79"/>
+          <w:sz w:val="26"/>
           <w:lang w:val="es-ES"/>
         </w:rPr>
       </w:pPr>
       <w:r>
         <w:rPr>
           <w:b/>
-          <w:sz w:val="22"/>
-          <w:lang w:val="es-ES"/>
-        </w:rPr>
-        <w:t>Construcción de Software II · Pruebas de integración en servicios REST</w:t>
+          <w:color w:val="1F4E79"/>
+          <w:sz w:val="26"/>
+          <w:lang w:val="es-ES"/>
+        </w:rPr>
+        <w:t>Mantenimiento del banco de pruebas</w:t>
       </w:r>
     </w:p>
     <w:p>
       <w:pPr>
-        <w:pStyle w:val="Ttulo1"/>
+        <w:pStyle w:val="Ttulo2"/>
       </w:pPr>
       <w:r>
-        <w:rPr>
-          <w:rFonts w:ascii="Arial" w:hAnsi="Arial"/>
-          <w:color w:val="1F4E79"/>
-        </w:rPr>
-        <w:t>4. Verificar dependencia de pruebas</w:t>
-      </w:r>
+        <w:lastRenderedPageBreak/>
+        <w:t xml:space="preserve">Verificar o crear la clase </w:t>
+      </w:r>
+      <w:proofErr w:type="spellStart"/>
+      <w:r>
+        <w:t>ProductoService</w:t>
+      </w:r>
+      <w:proofErr w:type="spellEnd"/>
     </w:p>
     <w:p>
       <w:pPr>
-        <w:spacing w:after="0"/>
-        <w:ind w:left="259"/>
-        <w:rPr>
-          <w:lang w:val="es-ES"/>
-        </w:rPr>
+        <w:pStyle w:val="Ttulo2"/>
       </w:pPr>
       <w:r>
         <w:rPr>
           <w:lang w:val="es-ES"/>
         </w:rPr>
         <w:drawing>
-          <wp:inline distT="0" distB="0" distL="0" distR="0" wp14:anchorId="3A4F44E3" wp14:editId="29E68BDA">
-            <wp:extent cx="5400040" cy="2834005"/>
-            <wp:effectExtent l="0" t="0" r="0" b="4445"/>
-            <wp:docPr id="819485663" name="Imagen 1"/>
+          <wp:inline distT="0" distB="0" distL="0" distR="0" wp14:anchorId="36490915" wp14:editId="091FA8D5">
+            <wp:extent cx="5400040" cy="3153410"/>
+            <wp:effectExtent l="0" t="0" r="0" b="8890"/>
+            <wp:docPr id="923367135" name="Imagen 1"/>
             <wp:cNvGraphicFramePr>
               <a:graphicFrameLocks xmlns:a="http://schemas.openxmlformats.org/drawingml/2006/main" noChangeAspect="1"/>
             </wp:cNvGraphicFramePr>
@@ -71,7 +73,7 @@
               <a:graphicData uri="http://schemas.openxmlformats.org/drawingml/2006/picture">
                 <pic:pic xmlns:pic="http://schemas.openxmlformats.org/drawingml/2006/picture">
                   <pic:nvPicPr>
-                    <pic:cNvPr id="819485663" name=""/>
+                    <pic:cNvPr id="923367135" name=""/>
                     <pic:cNvPicPr/>
                   </pic:nvPicPr>
                   <pic:blipFill>
@@ -83,7 +85,7 @@
                   <pic:spPr>
                     <a:xfrm>
                       <a:off x="0" y="0"/>
-                      <a:ext cx="5400040" cy="2834005"/>
+                      <a:ext cx="5400040" cy="3153410"/>
                     </a:xfrm>
                     <a:prstGeom prst="rect">
                       <a:avLst/>
@@ -95,14 +97,9 @@
           </wp:inline>
         </w:drawing>
       </w:r>
-    </w:p>
-    <w:p>
-      <w:pPr>
-        <w:spacing w:after="40"/>
-        <w:rPr>
-          <w:lang w:val="es-ES"/>
-        </w:rPr>
-      </w:pPr>
+      <w:r>
+        <w:t>4.4. Crear banco de pruebas unitarias</w:t>
+      </w:r>
     </w:p>
     <w:p>
       <w:pPr>
@@ -110,27 +107,16 @@
       </w:pPr>
       <w:r>
         <w:rPr>
-          <w:rFonts w:ascii="Arial" w:hAnsi="Arial"/>
-        </w:rPr>
-        <w:t>5.1. ProductoService.java</w:t>
-      </w:r>
-    </w:p>
-    <w:p>
-      <w:pPr>
-        <w:spacing w:after="40"/>
-        <w:rPr>
-          <w:lang w:val="es-ES"/>
-        </w:rPr>
-      </w:pPr>
-      <w:r>
-        <w:rPr>
-          <w:lang w:val="es-ES"/>
+          <w:rFonts w:ascii="Arial" w:eastAsia="Arial" w:hAnsi="Arial" w:cstheme="minorBidi"/>
+          <w:color w:val="auto"/>
+          <w:sz w:val="18"/>
+          <w:szCs w:val="22"/>
         </w:rPr>
         <w:drawing>
-          <wp:inline distT="0" distB="0" distL="0" distR="0" wp14:anchorId="2BAB9678" wp14:editId="10D4983D">
-            <wp:extent cx="5400040" cy="2550795"/>
-            <wp:effectExtent l="0" t="0" r="0" b="1905"/>
-            <wp:docPr id="1483028573" name="Imagen 1"/>
+          <wp:inline distT="0" distB="0" distL="0" distR="0" wp14:anchorId="2D16C688" wp14:editId="0DE6069E">
+            <wp:extent cx="5400040" cy="3147695"/>
+            <wp:effectExtent l="0" t="0" r="0" b="0"/>
+            <wp:docPr id="1169814678" name="Imagen 1"/>
             <wp:cNvGraphicFramePr>
               <a:graphicFrameLocks xmlns:a="http://schemas.openxmlformats.org/drawingml/2006/main" noChangeAspect="1"/>
             </wp:cNvGraphicFramePr>
@@ -138,7 +124,7 @@
               <a:graphicData uri="http://schemas.openxmlformats.org/drawingml/2006/picture">
                 <pic:pic xmlns:pic="http://schemas.openxmlformats.org/drawingml/2006/picture">
                   <pic:nvPicPr>
-                    <pic:cNvPr id="1483028573" name=""/>
+                    <pic:cNvPr id="1169814678" name=""/>
                     <pic:cNvPicPr/>
                   </pic:nvPicPr>
                   <pic:blipFill>
@@ -150,7 +136,7 @@
                   <pic:spPr>
                     <a:xfrm>
                       <a:off x="0" y="0"/>
-                      <a:ext cx="5400040" cy="2550795"/>
+                      <a:ext cx="5400040" cy="3147695"/>
                     </a:xfrm>
                     <a:prstGeom prst="rect">
                       <a:avLst/>
@@ -168,29 +154,26 @@
         <w:pStyle w:val="Ttulo2"/>
       </w:pPr>
       <w:r>
-        <w:rPr>
-          <w:rFonts w:ascii="Arial" w:hAnsi="Arial"/>
-        </w:rPr>
-        <w:lastRenderedPageBreak/>
-        <w:t>5.2. ProductoController.java</w:t>
+        <w:t>4.5. Ejecutar el banco de pruebas</w:t>
       </w:r>
     </w:p>
     <w:p>
       <w:pPr>
-        <w:spacing w:after="40"/>
-        <w:rPr>
-          <w:lang w:val="es-ES"/>
-        </w:rPr>
+        <w:pStyle w:val="Ttulo2"/>
       </w:pPr>
       <w:r>
         <w:rPr>
-          <w:lang w:val="es-ES"/>
-        </w:rPr>
+          <w:rFonts w:ascii="Courier New" w:eastAsia="Courier New" w:hAnsi="Courier New" w:cstheme="minorBidi"/>
+          <w:color w:val="auto"/>
+          <w:sz w:val="17"/>
+          <w:szCs w:val="22"/>
+        </w:rPr>
+        <w:lastRenderedPageBreak/>
         <w:drawing>
-          <wp:inline distT="0" distB="0" distL="0" distR="0" wp14:anchorId="1E9365E1" wp14:editId="4D1151B2">
-            <wp:extent cx="5400040" cy="3057525"/>
-            <wp:effectExtent l="0" t="0" r="0" b="9525"/>
-            <wp:docPr id="503049234" name="Imagen 1"/>
+          <wp:inline distT="0" distB="0" distL="0" distR="0" wp14:anchorId="66B2455B" wp14:editId="26B30B35">
+            <wp:extent cx="5400040" cy="1841500"/>
+            <wp:effectExtent l="0" t="0" r="0" b="6350"/>
+            <wp:docPr id="1612858314" name="Imagen 1"/>
             <wp:cNvGraphicFramePr>
               <a:graphicFrameLocks xmlns:a="http://schemas.openxmlformats.org/drawingml/2006/main" noChangeAspect="1"/>
             </wp:cNvGraphicFramePr>
@@ -198,7 +181,7 @@
               <a:graphicData uri="http://schemas.openxmlformats.org/drawingml/2006/picture">
                 <pic:pic xmlns:pic="http://schemas.openxmlformats.org/drawingml/2006/picture">
                   <pic:nvPicPr>
-                    <pic:cNvPr id="503049234" name=""/>
+                    <pic:cNvPr id="1612858314" name=""/>
                     <pic:cNvPicPr/>
                   </pic:nvPicPr>
                   <pic:blipFill>
@@ -210,7 +193,7 @@
                   <pic:spPr>
                     <a:xfrm>
                       <a:off x="0" y="0"/>
-                      <a:ext cx="5400040" cy="3057525"/>
+                      <a:ext cx="5400040" cy="1841500"/>
                     </a:xfrm>
                     <a:prstGeom prst="rect">
                       <a:avLst/>
@@ -222,35 +205,28 @@
           </wp:inline>
         </w:drawing>
       </w:r>
+      <w:r>
+        <w:t>4.6. Documentar el banco de pruebas</w:t>
+      </w:r>
     </w:p>
     <w:p>
       <w:pPr>
-        <w:pStyle w:val="Ttulo1"/>
+        <w:pStyle w:val="CodeBlock"/>
+        <w:rPr>
+          <w:lang w:val="es-ES"/>
+        </w:rPr>
       </w:pPr>
       <w:r>
         <w:rPr>
-          <w:rFonts w:ascii="Arial" w:hAnsi="Arial"/>
-          <w:color w:val="1F4E79"/>
-        </w:rPr>
-        <w:t>6. Crear prueba de integración REST</w:t>
-      </w:r>
-    </w:p>
-    <w:p>
-      <w:pPr>
-        <w:spacing w:after="40"/>
-        <w:rPr>
-          <w:lang w:val="es-ES"/>
-        </w:rPr>
-      </w:pPr>
-      <w:r>
-        <w:rPr>
+          <w:rFonts w:ascii="Arial" w:eastAsia="Arial" w:hAnsi="Arial"/>
+          <w:sz w:val="18"/>
           <w:lang w:val="es-ES"/>
         </w:rPr>
         <w:drawing>
-          <wp:inline distT="0" distB="0" distL="0" distR="0" wp14:anchorId="6076580F" wp14:editId="5B21EDE8">
-            <wp:extent cx="5400040" cy="2812415"/>
-            <wp:effectExtent l="0" t="0" r="0" b="6985"/>
-            <wp:docPr id="1276532948" name="Imagen 1"/>
+          <wp:inline distT="0" distB="0" distL="0" distR="0" wp14:anchorId="5AC937DA" wp14:editId="75FDB4A2">
+            <wp:extent cx="5400040" cy="2403475"/>
+            <wp:effectExtent l="0" t="0" r="0" b="0"/>
+            <wp:docPr id="176455701" name="Imagen 1"/>
             <wp:cNvGraphicFramePr>
               <a:graphicFrameLocks xmlns:a="http://schemas.openxmlformats.org/drawingml/2006/main" noChangeAspect="1"/>
             </wp:cNvGraphicFramePr>
@@ -258,7 +234,7 @@
               <a:graphicData uri="http://schemas.openxmlformats.org/drawingml/2006/picture">
                 <pic:pic xmlns:pic="http://schemas.openxmlformats.org/drawingml/2006/picture">
                   <pic:nvPicPr>
-                    <pic:cNvPr id="1276532948" name=""/>
+                    <pic:cNvPr id="176455701" name=""/>
                     <pic:cNvPicPr/>
                   </pic:nvPicPr>
                   <pic:blipFill>
@@ -270,7 +246,7 @@
                   <pic:spPr>
                     <a:xfrm>
                       <a:off x="0" y="0"/>
-                      <a:ext cx="5400040" cy="2812415"/>
+                      <a:ext cx="5400040" cy="2403475"/>
                     </a:xfrm>
                     <a:prstGeom prst="rect">
                       <a:avLst/>
@@ -285,15 +261,19 @@
     </w:p>
     <w:p>
       <w:pPr>
-        <w:pStyle w:val="Ttulo1"/>
+        <w:rPr>
+          <w:b/>
+          <w:bCs/>
+          <w:lang w:val="es-ES"/>
+        </w:rPr>
       </w:pPr>
       <w:r>
         <w:rPr>
-          <w:rFonts w:ascii="Arial" w:hAnsi="Arial"/>
-          <w:color w:val="1F4E79"/>
-        </w:rPr>
-        <w:lastRenderedPageBreak/>
-        <w:t>7. Ejecutar pruebas</w:t>
+          <w:b/>
+          <w:bCs/>
+          <w:lang w:val="es-ES"/>
+        </w:rPr>
+        <w:t xml:space="preserve">Reporte de Ejecución del Banco de Pruebas </w:t>
       </w:r>
     </w:p>
     <w:p>
@@ -306,41 +286,105 @@
         <w:rPr>
           <w:lang w:val="es-ES"/>
         </w:rPr>
-        <w:drawing>
-          <wp:inline distT="0" distB="0" distL="0" distR="0" wp14:anchorId="5B204EF2" wp14:editId="6091681B">
-            <wp:extent cx="5400040" cy="1863725"/>
-            <wp:effectExtent l="0" t="0" r="0" b="3175"/>
-            <wp:docPr id="276597816" name="Imagen 1"/>
-            <wp:cNvGraphicFramePr>
-              <a:graphicFrameLocks xmlns:a="http://schemas.openxmlformats.org/drawingml/2006/main" noChangeAspect="1"/>
-            </wp:cNvGraphicFramePr>
-            <a:graphic xmlns:a="http://schemas.openxmlformats.org/drawingml/2006/main">
-              <a:graphicData uri="http://schemas.openxmlformats.org/drawingml/2006/picture">
-                <pic:pic xmlns:pic="http://schemas.openxmlformats.org/drawingml/2006/picture">
-                  <pic:nvPicPr>
-                    <pic:cNvPr id="276597816" name=""/>
-                    <pic:cNvPicPr/>
-                  </pic:nvPicPr>
-                  <pic:blipFill>
-                    <a:blip r:embed="rId8"/>
-                    <a:stretch>
-                      <a:fillRect/>
-                    </a:stretch>
-                  </pic:blipFill>
-                  <pic:spPr>
-                    <a:xfrm>
-                      <a:off x="0" y="0"/>
-                      <a:ext cx="5400040" cy="1863725"/>
-                    </a:xfrm>
-                    <a:prstGeom prst="rect">
-                      <a:avLst/>
-                    </a:prstGeom>
-                  </pic:spPr>
-                </pic:pic>
-              </a:graphicData>
-            </a:graphic>
-          </wp:inline>
-        </w:drawing>
+        <w:t>[</w:t>
+      </w:r>
+      <w:proofErr w:type="spellStart"/>
+      <w:r>
+        <w:rPr>
+          <w:lang w:val="es-ES"/>
+        </w:rPr>
+        <w:t>cite_start</w:t>
+      </w:r>
+      <w:proofErr w:type="spellEnd"/>
+      <w:r>
+        <w:rPr>
+          <w:lang w:val="es-ES"/>
+        </w:rPr>
+        <w:t xml:space="preserve">]Se ejecutó el conjunto completo de pruebas del proyecto mediante el </w:t>
+      </w:r>
+      <w:proofErr w:type="gramStart"/>
+      <w:r>
+        <w:rPr>
+          <w:lang w:val="es-ES"/>
+        </w:rPr>
+        <w:t>comando .</w:t>
+      </w:r>
+      <w:proofErr w:type="gramEnd"/>
+      <w:r>
+        <w:rPr>
+          <w:lang w:val="es-ES"/>
+        </w:rPr>
+        <w:t>/</w:t>
+      </w:r>
+      <w:proofErr w:type="spellStart"/>
+      <w:r>
+        <w:rPr>
+          <w:lang w:val="es-ES"/>
+        </w:rPr>
+        <w:t>mvnw</w:t>
+      </w:r>
+      <w:proofErr w:type="spellEnd"/>
+      <w:r>
+        <w:rPr>
+          <w:lang w:val="es-ES"/>
+        </w:rPr>
+        <w:t xml:space="preserve"> </w:t>
+      </w:r>
+      <w:proofErr w:type="gramStart"/>
+      <w:r>
+        <w:rPr>
+          <w:lang w:val="es-ES"/>
+        </w:rPr>
+        <w:t>test[</w:t>
+      </w:r>
+      <w:proofErr w:type="gramEnd"/>
+      <w:r>
+        <w:rPr>
+          <w:lang w:val="es-ES"/>
+        </w:rPr>
+        <w:t>cite: 325, 328]. [</w:t>
+      </w:r>
+      <w:proofErr w:type="spellStart"/>
+      <w:r>
+        <w:rPr>
+          <w:lang w:val="es-ES"/>
+        </w:rPr>
+        <w:t>cite_start</w:t>
+      </w:r>
+      <w:proofErr w:type="spellEnd"/>
+      <w:r>
+        <w:rPr>
+          <w:lang w:val="es-ES"/>
+        </w:rPr>
+        <w:t>]El banco de pruebas se ejecutó de manera exitosa, procesando tanto las pruebas unitarias como las de integración sin registrar fallos ni errores [cite: 211][</w:t>
+      </w:r>
+      <w:proofErr w:type="spellStart"/>
+      <w:r>
+        <w:rPr>
+          <w:lang w:val="es-ES"/>
+        </w:rPr>
+        <w:t>cite_start</w:t>
+      </w:r>
+      <w:proofErr w:type="spellEnd"/>
+      <w:r>
+        <w:rPr>
+          <w:lang w:val="es-ES"/>
+        </w:rPr>
+        <w:t xml:space="preserve">], lo que garantiza la estabilidad técnica ante los cambios </w:t>
+      </w:r>
+      <w:proofErr w:type="gramStart"/>
+      <w:r>
+        <w:rPr>
+          <w:lang w:val="es-ES"/>
+        </w:rPr>
+        <w:t>realizados[</w:t>
+      </w:r>
+      <w:proofErr w:type="gramEnd"/>
+      <w:r>
+        <w:rPr>
+          <w:lang w:val="es-ES"/>
+        </w:rPr>
+        <w:t>cite: 213, 331].</w:t>
       </w:r>
     </w:p>
     <w:p>
@@ -348,6 +392,459 @@
         <w:rPr>
           <w:lang w:val="es-ES"/>
         </w:rPr>
+      </w:pPr>
+      <w:r>
+        <w:rPr>
+          <w:lang w:val="es-ES"/>
+        </w:rPr>
+        <w:t>Resumen de Resultados</w:t>
+      </w:r>
+    </w:p>
+    <w:tbl>
+      <w:tblPr>
+        <w:tblStyle w:val="Tablaconcuadrcula1clara"/>
+        <w:tblW w:w="0" w:type="auto"/>
+        <w:tblLook w:val="04A0" w:firstRow="1" w:lastRow="0" w:firstColumn="1" w:lastColumn="0" w:noHBand="0" w:noVBand="1"/>
+      </w:tblPr>
+      <w:tblGrid>
+        <w:gridCol w:w="2807"/>
+        <w:gridCol w:w="3328"/>
+      </w:tblGrid>
+      <w:tr>
+        <w:trPr>
+          <w:cnfStyle w:val="100000000000" w:firstRow="1" w:lastRow="0" w:firstColumn="0" w:lastColumn="0" w:oddVBand="0" w:evenVBand="0" w:oddHBand="0" w:evenHBand="0" w:firstRowFirstColumn="0" w:firstRowLastColumn="0" w:lastRowFirstColumn="0" w:lastRowLastColumn="0"/>
+        </w:trPr>
+        <w:tc>
+          <w:tcPr>
+            <w:cnfStyle w:val="001000000000" w:firstRow="0" w:lastRow="0" w:firstColumn="1" w:lastColumn="0" w:oddVBand="0" w:evenVBand="0" w:oddHBand="0" w:evenHBand="0" w:firstRowFirstColumn="0" w:firstRowLastColumn="0" w:lastRowFirstColumn="0" w:lastRowLastColumn="0"/>
+            <w:tcW w:w="0" w:type="auto"/>
+            <w:hideMark/>
+          </w:tcPr>
+          <w:p>
+            <w:pPr>
+              <w:rPr>
+                <w:lang w:val="es-ES"/>
+              </w:rPr>
+            </w:pPr>
+            <w:r>
+              <w:rPr>
+                <w:lang w:val="es-ES"/>
+              </w:rPr>
+              <w:t>Métrica</w:t>
+            </w:r>
+          </w:p>
+        </w:tc>
+        <w:tc>
+          <w:tcPr>
+            <w:tcW w:w="0" w:type="auto"/>
+            <w:hideMark/>
+          </w:tcPr>
+          <w:p>
+            <w:pPr>
+              <w:cnfStyle w:val="100000000000" w:firstRow="1" w:lastRow="0" w:firstColumn="0" w:lastColumn="0" w:oddVBand="0" w:evenVBand="0" w:oddHBand="0" w:evenHBand="0" w:firstRowFirstColumn="0" w:firstRowLastColumn="0" w:lastRowFirstColumn="0" w:lastRowLastColumn="0"/>
+              <w:rPr>
+                <w:lang w:val="es-ES"/>
+              </w:rPr>
+            </w:pPr>
+            <w:r>
+              <w:rPr>
+                <w:lang w:val="es-ES"/>
+              </w:rPr>
+              <w:t>Valor</w:t>
+            </w:r>
+          </w:p>
+        </w:tc>
+      </w:tr>
+      <w:tr>
+        <w:tc>
+          <w:tcPr>
+            <w:cnfStyle w:val="001000000000" w:firstRow="0" w:lastRow="0" w:firstColumn="1" w:lastColumn="0" w:oddVBand="0" w:evenVBand="0" w:oddHBand="0" w:evenHBand="0" w:firstRowFirstColumn="0" w:firstRowLastColumn="0" w:lastRowFirstColumn="0" w:lastRowLastColumn="0"/>
+            <w:tcW w:w="0" w:type="auto"/>
+            <w:hideMark/>
+          </w:tcPr>
+          <w:p>
+            <w:pPr>
+              <w:rPr>
+                <w:lang w:val="es-ES"/>
+              </w:rPr>
+            </w:pPr>
+            <w:proofErr w:type="gramStart"/>
+            <w:r>
+              <w:rPr>
+                <w:lang w:val="es-ES"/>
+              </w:rPr>
+              <w:t>Total</w:t>
+            </w:r>
+            <w:proofErr w:type="gramEnd"/>
+            <w:r>
+              <w:rPr>
+                <w:lang w:val="es-ES"/>
+              </w:rPr>
+              <w:t xml:space="preserve"> de Pruebas Ejecutadas</w:t>
+            </w:r>
+          </w:p>
+        </w:tc>
+        <w:tc>
+          <w:tcPr>
+            <w:tcW w:w="0" w:type="auto"/>
+            <w:hideMark/>
+          </w:tcPr>
+          <w:p>
+            <w:pPr>
+              <w:cnfStyle w:val="000000000000" w:firstRow="0" w:lastRow="0" w:firstColumn="0" w:lastColumn="0" w:oddVBand="0" w:evenVBand="0" w:oddHBand="0" w:evenHBand="0" w:firstRowFirstColumn="0" w:firstRowLastColumn="0" w:lastRowFirstColumn="0" w:lastRowLastColumn="0"/>
+              <w:rPr>
+                <w:lang w:val="es-ES"/>
+              </w:rPr>
+            </w:pPr>
+            <w:r>
+              <w:rPr>
+                <w:lang w:val="es-ES"/>
+              </w:rPr>
+              <w:t>[</w:t>
+            </w:r>
+            <w:proofErr w:type="spellStart"/>
+            <w:r>
+              <w:rPr>
+                <w:lang w:val="es-ES"/>
+              </w:rPr>
+              <w:t>cite_start</w:t>
+            </w:r>
+            <w:proofErr w:type="spellEnd"/>
+            <w:r>
+              <w:rPr>
+                <w:lang w:val="es-ES"/>
+              </w:rPr>
+              <w:t>]</w:t>
+            </w:r>
+            <w:r>
+              <w:rPr>
+                <w:lang w:val="es-ES"/>
+              </w:rPr>
+              <w:t>5</w:t>
+            </w:r>
+            <w:r>
+              <w:rPr>
+                <w:lang w:val="es-ES"/>
+              </w:rPr>
+              <w:t xml:space="preserve"> [cite: 201]</w:t>
+            </w:r>
+          </w:p>
+        </w:tc>
+      </w:tr>
+      <w:tr>
+        <w:tc>
+          <w:tcPr>
+            <w:cnfStyle w:val="001000000000" w:firstRow="0" w:lastRow="0" w:firstColumn="1" w:lastColumn="0" w:oddVBand="0" w:evenVBand="0" w:oddHBand="0" w:evenHBand="0" w:firstRowFirstColumn="0" w:firstRowLastColumn="0" w:lastRowFirstColumn="0" w:lastRowLastColumn="0"/>
+            <w:tcW w:w="0" w:type="auto"/>
+            <w:hideMark/>
+          </w:tcPr>
+          <w:p>
+            <w:pPr>
+              <w:rPr>
+                <w:lang w:val="es-ES"/>
+              </w:rPr>
+            </w:pPr>
+            <w:r>
+              <w:rPr>
+                <w:lang w:val="es-ES"/>
+              </w:rPr>
+              <w:t>Pruebas Fallidas (</w:t>
+            </w:r>
+            <w:proofErr w:type="spellStart"/>
+            <w:r>
+              <w:rPr>
+                <w:lang w:val="es-ES"/>
+              </w:rPr>
+              <w:t>Failures</w:t>
+            </w:r>
+            <w:proofErr w:type="spellEnd"/>
+            <w:r>
+              <w:rPr>
+                <w:lang w:val="es-ES"/>
+              </w:rPr>
+              <w:t>)</w:t>
+            </w:r>
+          </w:p>
+        </w:tc>
+        <w:tc>
+          <w:tcPr>
+            <w:tcW w:w="0" w:type="auto"/>
+            <w:hideMark/>
+          </w:tcPr>
+          <w:p>
+            <w:pPr>
+              <w:cnfStyle w:val="000000000000" w:firstRow="0" w:lastRow="0" w:firstColumn="0" w:lastColumn="0" w:oddVBand="0" w:evenVBand="0" w:oddHBand="0" w:evenHBand="0" w:firstRowFirstColumn="0" w:firstRowLastColumn="0" w:lastRowFirstColumn="0" w:lastRowLastColumn="0"/>
+              <w:rPr>
+                <w:lang w:val="es-ES"/>
+              </w:rPr>
+            </w:pPr>
+            <w:r>
+              <w:rPr>
+                <w:lang w:val="es-ES"/>
+              </w:rPr>
+              <w:t>[</w:t>
+            </w:r>
+            <w:proofErr w:type="spellStart"/>
+            <w:r>
+              <w:rPr>
+                <w:lang w:val="es-ES"/>
+              </w:rPr>
+              <w:t>cite_start</w:t>
+            </w:r>
+            <w:proofErr w:type="spellEnd"/>
+            <w:r>
+              <w:rPr>
+                <w:lang w:val="es-ES"/>
+              </w:rPr>
+              <w:t>]0 [cite: 201]</w:t>
+            </w:r>
+          </w:p>
+        </w:tc>
+      </w:tr>
+      <w:tr>
+        <w:tc>
+          <w:tcPr>
+            <w:cnfStyle w:val="001000000000" w:firstRow="0" w:lastRow="0" w:firstColumn="1" w:lastColumn="0" w:oddVBand="0" w:evenVBand="0" w:oddHBand="0" w:evenHBand="0" w:firstRowFirstColumn="0" w:firstRowLastColumn="0" w:lastRowFirstColumn="0" w:lastRowLastColumn="0"/>
+            <w:tcW w:w="0" w:type="auto"/>
+            <w:hideMark/>
+          </w:tcPr>
+          <w:p>
+            <w:pPr>
+              <w:rPr>
+                <w:lang w:val="es-ES"/>
+              </w:rPr>
+            </w:pPr>
+            <w:r>
+              <w:rPr>
+                <w:lang w:val="es-ES"/>
+              </w:rPr>
+              <w:t>Pruebas con Errores (</w:t>
+            </w:r>
+            <w:proofErr w:type="spellStart"/>
+            <w:r>
+              <w:rPr>
+                <w:lang w:val="es-ES"/>
+              </w:rPr>
+              <w:t>Errors</w:t>
+            </w:r>
+            <w:proofErr w:type="spellEnd"/>
+            <w:r>
+              <w:rPr>
+                <w:lang w:val="es-ES"/>
+              </w:rPr>
+              <w:t>)</w:t>
+            </w:r>
+          </w:p>
+        </w:tc>
+        <w:tc>
+          <w:tcPr>
+            <w:tcW w:w="0" w:type="auto"/>
+            <w:hideMark/>
+          </w:tcPr>
+          <w:p>
+            <w:pPr>
+              <w:cnfStyle w:val="000000000000" w:firstRow="0" w:lastRow="0" w:firstColumn="0" w:lastColumn="0" w:oddVBand="0" w:evenVBand="0" w:oddHBand="0" w:evenHBand="0" w:firstRowFirstColumn="0" w:firstRowLastColumn="0" w:lastRowFirstColumn="0" w:lastRowLastColumn="0"/>
+              <w:rPr>
+                <w:lang w:val="es-ES"/>
+              </w:rPr>
+            </w:pPr>
+            <w:r>
+              <w:rPr>
+                <w:lang w:val="es-ES"/>
+              </w:rPr>
+              <w:t>[</w:t>
+            </w:r>
+            <w:proofErr w:type="spellStart"/>
+            <w:r>
+              <w:rPr>
+                <w:lang w:val="es-ES"/>
+              </w:rPr>
+              <w:t>cite_start</w:t>
+            </w:r>
+            <w:proofErr w:type="spellEnd"/>
+            <w:r>
+              <w:rPr>
+                <w:lang w:val="es-ES"/>
+              </w:rPr>
+              <w:t>]0 [cite: 201]</w:t>
+            </w:r>
+          </w:p>
+        </w:tc>
+      </w:tr>
+      <w:tr>
+        <w:tc>
+          <w:tcPr>
+            <w:cnfStyle w:val="001000000000" w:firstRow="0" w:lastRow="0" w:firstColumn="1" w:lastColumn="0" w:oddVBand="0" w:evenVBand="0" w:oddHBand="0" w:evenHBand="0" w:firstRowFirstColumn="0" w:firstRowLastColumn="0" w:lastRowFirstColumn="0" w:lastRowLastColumn="0"/>
+            <w:tcW w:w="0" w:type="auto"/>
+            <w:hideMark/>
+          </w:tcPr>
+          <w:p>
+            <w:pPr>
+              <w:rPr>
+                <w:lang w:val="es-ES"/>
+              </w:rPr>
+            </w:pPr>
+            <w:r>
+              <w:rPr>
+                <w:lang w:val="es-ES"/>
+              </w:rPr>
+              <w:t>Pruebas Omitidas (</w:t>
+            </w:r>
+            <w:proofErr w:type="spellStart"/>
+            <w:r>
+              <w:rPr>
+                <w:lang w:val="es-ES"/>
+              </w:rPr>
+              <w:t>Skipped</w:t>
+            </w:r>
+            <w:proofErr w:type="spellEnd"/>
+            <w:r>
+              <w:rPr>
+                <w:lang w:val="es-ES"/>
+              </w:rPr>
+              <w:t>)</w:t>
+            </w:r>
+          </w:p>
+        </w:tc>
+        <w:tc>
+          <w:tcPr>
+            <w:tcW w:w="0" w:type="auto"/>
+            <w:hideMark/>
+          </w:tcPr>
+          <w:p>
+            <w:pPr>
+              <w:cnfStyle w:val="000000000000" w:firstRow="0" w:lastRow="0" w:firstColumn="0" w:lastColumn="0" w:oddVBand="0" w:evenVBand="0" w:oddHBand="0" w:evenHBand="0" w:firstRowFirstColumn="0" w:firstRowLastColumn="0" w:lastRowFirstColumn="0" w:lastRowLastColumn="0"/>
+              <w:rPr>
+                <w:lang w:val="es-ES"/>
+              </w:rPr>
+            </w:pPr>
+            <w:r>
+              <w:rPr>
+                <w:lang w:val="es-ES"/>
+              </w:rPr>
+              <w:t>[</w:t>
+            </w:r>
+            <w:proofErr w:type="spellStart"/>
+            <w:r>
+              <w:rPr>
+                <w:lang w:val="es-ES"/>
+              </w:rPr>
+              <w:t>cite_start</w:t>
+            </w:r>
+            <w:proofErr w:type="spellEnd"/>
+            <w:r>
+              <w:rPr>
+                <w:lang w:val="es-ES"/>
+              </w:rPr>
+              <w:t>]0 [cite: 201]</w:t>
+            </w:r>
+          </w:p>
+        </w:tc>
+      </w:tr>
+      <w:tr>
+        <w:tc>
+          <w:tcPr>
+            <w:cnfStyle w:val="001000000000" w:firstRow="0" w:lastRow="0" w:firstColumn="1" w:lastColumn="0" w:oddVBand="0" w:evenVBand="0" w:oddHBand="0" w:evenHBand="0" w:firstRowFirstColumn="0" w:firstRowLastColumn="0" w:lastRowFirstColumn="0" w:lastRowLastColumn="0"/>
+            <w:tcW w:w="0" w:type="auto"/>
+            <w:hideMark/>
+          </w:tcPr>
+          <w:p>
+            <w:pPr>
+              <w:rPr>
+                <w:lang w:val="es-ES"/>
+              </w:rPr>
+            </w:pPr>
+            <w:r>
+              <w:rPr>
+                <w:lang w:val="es-ES"/>
+              </w:rPr>
+              <w:t>Tiempo Total de Construcción</w:t>
+            </w:r>
+          </w:p>
+        </w:tc>
+        <w:tc>
+          <w:tcPr>
+            <w:tcW w:w="0" w:type="auto"/>
+            <w:hideMark/>
+          </w:tcPr>
+          <w:p>
+            <w:pPr>
+              <w:cnfStyle w:val="000000000000" w:firstRow="0" w:lastRow="0" w:firstColumn="0" w:lastColumn="0" w:oddVBand="0" w:evenVBand="0" w:oddHBand="0" w:evenHBand="0" w:firstRowFirstColumn="0" w:firstRowLastColumn="0" w:lastRowFirstColumn="0" w:lastRowLastColumn="0"/>
+              <w:rPr>
+                <w:lang w:val="es-ES"/>
+              </w:rPr>
+            </w:pPr>
+            <w:r>
+              <w:rPr>
+                <w:lang w:val="es-ES"/>
+              </w:rPr>
+              <w:t>3.556</w:t>
+            </w:r>
+            <w:r>
+              <w:rPr>
+                <w:lang w:val="es-ES"/>
+              </w:rPr>
+              <w:t xml:space="preserve"> s</w:t>
+            </w:r>
+          </w:p>
+        </w:tc>
+      </w:tr>
+      <w:tr>
+        <w:tc>
+          <w:tcPr>
+            <w:cnfStyle w:val="001000000000" w:firstRow="0" w:lastRow="0" w:firstColumn="1" w:lastColumn="0" w:oddVBand="0" w:evenVBand="0" w:oddHBand="0" w:evenHBand="0" w:firstRowFirstColumn="0" w:firstRowLastColumn="0" w:lastRowFirstColumn="0" w:lastRowLastColumn="0"/>
+            <w:tcW w:w="0" w:type="auto"/>
+            <w:hideMark/>
+          </w:tcPr>
+          <w:p>
+            <w:pPr>
+              <w:rPr>
+                <w:lang w:val="es-ES"/>
+              </w:rPr>
+            </w:pPr>
+            <w:r>
+              <w:rPr>
+                <w:lang w:val="es-ES"/>
+              </w:rPr>
+              <w:t>Estado Final</w:t>
+            </w:r>
+          </w:p>
+        </w:tc>
+        <w:tc>
+          <w:tcPr>
+            <w:tcW w:w="0" w:type="auto"/>
+            <w:hideMark/>
+          </w:tcPr>
+          <w:p>
+            <w:pPr>
+              <w:cnfStyle w:val="000000000000" w:firstRow="0" w:lastRow="0" w:firstColumn="0" w:lastColumn="0" w:oddVBand="0" w:evenVBand="0" w:oddHBand="0" w:evenHBand="0" w:firstRowFirstColumn="0" w:firstRowLastColumn="0" w:lastRowFirstColumn="0" w:lastRowLastColumn="0"/>
+            </w:pPr>
+            <w:r>
+              <w:t>[</w:t>
+            </w:r>
+            <w:proofErr w:type="spellStart"/>
+            <w:r>
+              <w:t>cite_</w:t>
+            </w:r>
+            <w:proofErr w:type="gramStart"/>
+            <w:r>
+              <w:t>start</w:t>
+            </w:r>
+            <w:proofErr w:type="spellEnd"/>
+            <w:r>
+              <w:t>]BUILD</w:t>
+            </w:r>
+            <w:proofErr w:type="gramEnd"/>
+            <w:r>
+              <w:t xml:space="preserve"> SUCCESS [cite: 325]</w:t>
+            </w:r>
+          </w:p>
+        </w:tc>
+      </w:tr>
+    </w:tbl>
+    <w:p>
+      <w:pPr>
+        <w:pStyle w:val="CodeBlock"/>
       </w:pPr>
     </w:p>
     <w:sectPr>
@@ -760,15 +1257,14 @@
   <w:style w:type="paragraph" w:default="1" w:styleId="Normal">
     <w:name w:val="Normal"/>
     <w:qFormat/>
-    <w:rsid w:val="009B0A14"/>
+    <w:rsid w:val="0043036E"/>
     <w:pPr>
-      <w:suppressAutoHyphens/>
       <w:spacing w:after="200" w:line="276" w:lineRule="auto"/>
     </w:pPr>
     <w:rPr>
       <w:rFonts w:ascii="Arial" w:eastAsia="Arial" w:hAnsi="Arial"/>
       <w:kern w:val="0"/>
-      <w:sz w:val="19"/>
+      <w:sz w:val="18"/>
       <w:lang w:val="en-US"/>
       <w14:ligatures w14:val="none"/>
     </w:rPr>
@@ -780,22 +1276,18 @@
     <w:link w:val="Ttulo1Car"/>
     <w:uiPriority w:val="9"/>
     <w:qFormat/>
-    <w:rsid w:val="009B0A14"/>
+    <w:rsid w:val="0043036E"/>
     <w:pPr>
       <w:keepNext/>
       <w:keepLines/>
-      <w:suppressAutoHyphens w:val="0"/>
-      <w:spacing w:before="360" w:after="80" w:line="259" w:lineRule="auto"/>
+      <w:spacing w:before="360" w:after="80"/>
       <w:outlineLvl w:val="0"/>
     </w:pPr>
     <w:rPr>
       <w:rFonts w:asciiTheme="majorHAnsi" w:eastAsiaTheme="majorEastAsia" w:hAnsiTheme="majorHAnsi" w:cstheme="majorBidi"/>
       <w:color w:val="0F4761" w:themeColor="accent1" w:themeShade="BF"/>
-      <w:kern w:val="2"/>
       <w:sz w:val="40"/>
       <w:szCs w:val="40"/>
-      <w:lang w:val="es-ES"/>
-      <w14:ligatures w14:val="standardContextual"/>
     </w:rPr>
   </w:style>
   <w:style w:type="paragraph" w:styleId="Ttulo2">
@@ -804,25 +1296,20 @@
     <w:next w:val="Normal"/>
     <w:link w:val="Ttulo2Car"/>
     <w:uiPriority w:val="9"/>
-    <w:semiHidden/>
     <w:unhideWhenUsed/>
     <w:qFormat/>
-    <w:rsid w:val="009B0A14"/>
+    <w:rsid w:val="0043036E"/>
     <w:pPr>
       <w:keepNext/>
       <w:keepLines/>
-      <w:suppressAutoHyphens w:val="0"/>
-      <w:spacing w:before="160" w:after="80" w:line="259" w:lineRule="auto"/>
+      <w:spacing w:before="160" w:after="80"/>
       <w:outlineLvl w:val="1"/>
     </w:pPr>
     <w:rPr>
       <w:rFonts w:asciiTheme="majorHAnsi" w:eastAsiaTheme="majorEastAsia" w:hAnsiTheme="majorHAnsi" w:cstheme="majorBidi"/>
       <w:color w:val="0F4761" w:themeColor="accent1" w:themeShade="BF"/>
-      <w:kern w:val="2"/>
       <w:sz w:val="32"/>
       <w:szCs w:val="32"/>
-      <w:lang w:val="es-ES"/>
-      <w14:ligatures w14:val="standardContextual"/>
     </w:rPr>
   </w:style>
   <w:style w:type="paragraph" w:styleId="Ttulo3">
@@ -834,22 +1321,18 @@
     <w:semiHidden/>
     <w:unhideWhenUsed/>
     <w:qFormat/>
-    <w:rsid w:val="009B0A14"/>
+    <w:rsid w:val="0043036E"/>
     <w:pPr>
       <w:keepNext/>
       <w:keepLines/>
-      <w:suppressAutoHyphens w:val="0"/>
-      <w:spacing w:before="160" w:after="80" w:line="259" w:lineRule="auto"/>
+      <w:spacing w:before="160" w:after="80"/>
       <w:outlineLvl w:val="2"/>
     </w:pPr>
     <w:rPr>
-      <w:rFonts w:asciiTheme="minorHAnsi" w:eastAsiaTheme="majorEastAsia" w:hAnsiTheme="minorHAnsi" w:cstheme="majorBidi"/>
+      <w:rFonts w:eastAsiaTheme="majorEastAsia" w:cstheme="majorBidi"/>
       <w:color w:val="0F4761" w:themeColor="accent1" w:themeShade="BF"/>
-      <w:kern w:val="2"/>
       <w:sz w:val="28"/>
       <w:szCs w:val="28"/>
-      <w:lang w:val="es-ES"/>
-      <w14:ligatures w14:val="standardContextual"/>
     </w:rPr>
   </w:style>
   <w:style w:type="paragraph" w:styleId="Ttulo4">
@@ -861,23 +1344,18 @@
     <w:semiHidden/>
     <w:unhideWhenUsed/>
     <w:qFormat/>
-    <w:rsid w:val="009B0A14"/>
+    <w:rsid w:val="0043036E"/>
     <w:pPr>
       <w:keepNext/>
       <w:keepLines/>
-      <w:suppressAutoHyphens w:val="0"/>
-      <w:spacing w:before="80" w:after="40" w:line="259" w:lineRule="auto"/>
+      <w:spacing w:before="80" w:after="40"/>
       <w:outlineLvl w:val="3"/>
     </w:pPr>
     <w:rPr>
-      <w:rFonts w:asciiTheme="minorHAnsi" w:eastAsiaTheme="majorEastAsia" w:hAnsiTheme="minorHAnsi" w:cstheme="majorBidi"/>
+      <w:rFonts w:eastAsiaTheme="majorEastAsia" w:cstheme="majorBidi"/>
       <w:i/>
       <w:iCs/>
       <w:color w:val="0F4761" w:themeColor="accent1" w:themeShade="BF"/>
-      <w:kern w:val="2"/>
-      <w:sz w:val="22"/>
-      <w:lang w:val="es-ES"/>
-      <w14:ligatures w14:val="standardContextual"/>
     </w:rPr>
   </w:style>
   <w:style w:type="paragraph" w:styleId="Ttulo5">
@@ -889,21 +1367,16 @@
     <w:semiHidden/>
     <w:unhideWhenUsed/>
     <w:qFormat/>
-    <w:rsid w:val="009B0A14"/>
+    <w:rsid w:val="0043036E"/>
     <w:pPr>
       <w:keepNext/>
       <w:keepLines/>
-      <w:suppressAutoHyphens w:val="0"/>
-      <w:spacing w:before="80" w:after="40" w:line="259" w:lineRule="auto"/>
+      <w:spacing w:before="80" w:after="40"/>
       <w:outlineLvl w:val="4"/>
     </w:pPr>
     <w:rPr>
-      <w:rFonts w:asciiTheme="minorHAnsi" w:eastAsiaTheme="majorEastAsia" w:hAnsiTheme="minorHAnsi" w:cstheme="majorBidi"/>
+      <w:rFonts w:eastAsiaTheme="majorEastAsia" w:cstheme="majorBidi"/>
       <w:color w:val="0F4761" w:themeColor="accent1" w:themeShade="BF"/>
-      <w:kern w:val="2"/>
-      <w:sz w:val="22"/>
-      <w:lang w:val="es-ES"/>
-      <w14:ligatures w14:val="standardContextual"/>
     </w:rPr>
   </w:style>
   <w:style w:type="paragraph" w:styleId="Ttulo6">
@@ -915,23 +1388,18 @@
     <w:semiHidden/>
     <w:unhideWhenUsed/>
     <w:qFormat/>
-    <w:rsid w:val="009B0A14"/>
+    <w:rsid w:val="0043036E"/>
     <w:pPr>
       <w:keepNext/>
       <w:keepLines/>
-      <w:suppressAutoHyphens w:val="0"/>
-      <w:spacing w:before="40" w:after="0" w:line="259" w:lineRule="auto"/>
+      <w:spacing w:before="40" w:after="0"/>
       <w:outlineLvl w:val="5"/>
     </w:pPr>
     <w:rPr>
-      <w:rFonts w:asciiTheme="minorHAnsi" w:eastAsiaTheme="majorEastAsia" w:hAnsiTheme="minorHAnsi" w:cstheme="majorBidi"/>
+      <w:rFonts w:eastAsiaTheme="majorEastAsia" w:cstheme="majorBidi"/>
       <w:i/>
       <w:iCs/>
       <w:color w:val="595959" w:themeColor="text1" w:themeTint="A6"/>
-      <w:kern w:val="2"/>
-      <w:sz w:val="22"/>
-      <w:lang w:val="es-ES"/>
-      <w14:ligatures w14:val="standardContextual"/>
     </w:rPr>
   </w:style>
   <w:style w:type="paragraph" w:styleId="Ttulo7">
@@ -943,21 +1411,16 @@
     <w:semiHidden/>
     <w:unhideWhenUsed/>
     <w:qFormat/>
-    <w:rsid w:val="009B0A14"/>
+    <w:rsid w:val="0043036E"/>
     <w:pPr>
       <w:keepNext/>
       <w:keepLines/>
-      <w:suppressAutoHyphens w:val="0"/>
-      <w:spacing w:before="40" w:after="0" w:line="259" w:lineRule="auto"/>
+      <w:spacing w:before="40" w:after="0"/>
       <w:outlineLvl w:val="6"/>
     </w:pPr>
     <w:rPr>
-      <w:rFonts w:asciiTheme="minorHAnsi" w:eastAsiaTheme="majorEastAsia" w:hAnsiTheme="minorHAnsi" w:cstheme="majorBidi"/>
+      <w:rFonts w:eastAsiaTheme="majorEastAsia" w:cstheme="majorBidi"/>
       <w:color w:val="595959" w:themeColor="text1" w:themeTint="A6"/>
-      <w:kern w:val="2"/>
-      <w:sz w:val="22"/>
-      <w:lang w:val="es-ES"/>
-      <w14:ligatures w14:val="standardContextual"/>
     </w:rPr>
   </w:style>
   <w:style w:type="paragraph" w:styleId="Ttulo8">
@@ -969,23 +1432,18 @@
     <w:semiHidden/>
     <w:unhideWhenUsed/>
     <w:qFormat/>
-    <w:rsid w:val="009B0A14"/>
+    <w:rsid w:val="0043036E"/>
     <w:pPr>
       <w:keepNext/>
       <w:keepLines/>
-      <w:suppressAutoHyphens w:val="0"/>
-      <w:spacing w:after="0" w:line="259" w:lineRule="auto"/>
+      <w:spacing w:after="0"/>
       <w:outlineLvl w:val="7"/>
     </w:pPr>
     <w:rPr>
-      <w:rFonts w:asciiTheme="minorHAnsi" w:eastAsiaTheme="majorEastAsia" w:hAnsiTheme="minorHAnsi" w:cstheme="majorBidi"/>
+      <w:rFonts w:eastAsiaTheme="majorEastAsia" w:cstheme="majorBidi"/>
       <w:i/>
       <w:iCs/>
       <w:color w:val="272727" w:themeColor="text1" w:themeTint="D8"/>
-      <w:kern w:val="2"/>
-      <w:sz w:val="22"/>
-      <w:lang w:val="es-ES"/>
-      <w14:ligatures w14:val="standardContextual"/>
     </w:rPr>
   </w:style>
   <w:style w:type="paragraph" w:styleId="Ttulo9">
@@ -997,27 +1455,21 @@
     <w:semiHidden/>
     <w:unhideWhenUsed/>
     <w:qFormat/>
-    <w:rsid w:val="009B0A14"/>
+    <w:rsid w:val="0043036E"/>
     <w:pPr>
       <w:keepNext/>
       <w:keepLines/>
-      <w:suppressAutoHyphens w:val="0"/>
-      <w:spacing w:after="0" w:line="259" w:lineRule="auto"/>
+      <w:spacing w:after="0"/>
       <w:outlineLvl w:val="8"/>
     </w:pPr>
     <w:rPr>
-      <w:rFonts w:asciiTheme="minorHAnsi" w:eastAsiaTheme="majorEastAsia" w:hAnsiTheme="minorHAnsi" w:cstheme="majorBidi"/>
+      <w:rFonts w:eastAsiaTheme="majorEastAsia" w:cstheme="majorBidi"/>
       <w:color w:val="272727" w:themeColor="text1" w:themeTint="D8"/>
-      <w:kern w:val="2"/>
-      <w:sz w:val="22"/>
-      <w:lang w:val="es-ES"/>
-      <w14:ligatures w14:val="standardContextual"/>
     </w:rPr>
   </w:style>
   <w:style w:type="character" w:default="1" w:styleId="Fuentedeprrafopredeter">
     <w:name w:val="Default Paragraph Font"/>
     <w:uiPriority w:val="1"/>
-    <w:semiHidden/>
     <w:unhideWhenUsed/>
   </w:style>
   <w:style w:type="table" w:default="1" w:styleId="Tablanormal">
@@ -1046,7 +1498,7 @@
     <w:basedOn w:val="Fuentedeprrafopredeter"/>
     <w:link w:val="Ttulo1"/>
     <w:uiPriority w:val="9"/>
-    <w:rsid w:val="009B0A14"/>
+    <w:rsid w:val="0043036E"/>
     <w:rPr>
       <w:rFonts w:asciiTheme="majorHAnsi" w:eastAsiaTheme="majorEastAsia" w:hAnsiTheme="majorHAnsi" w:cstheme="majorBidi"/>
       <w:color w:val="0F4761" w:themeColor="accent1" w:themeShade="BF"/>
@@ -1059,8 +1511,7 @@
     <w:basedOn w:val="Fuentedeprrafopredeter"/>
     <w:link w:val="Ttulo2"/>
     <w:uiPriority w:val="9"/>
-    <w:semiHidden/>
-    <w:rsid w:val="009B0A14"/>
+    <w:rsid w:val="0043036E"/>
     <w:rPr>
       <w:rFonts w:asciiTheme="majorHAnsi" w:eastAsiaTheme="majorEastAsia" w:hAnsiTheme="majorHAnsi" w:cstheme="majorBidi"/>
       <w:color w:val="0F4761" w:themeColor="accent1" w:themeShade="BF"/>
@@ -1074,7 +1525,7 @@
     <w:link w:val="Ttulo3"/>
     <w:uiPriority w:val="9"/>
     <w:semiHidden/>
-    <w:rsid w:val="009B0A14"/>
+    <w:rsid w:val="0043036E"/>
     <w:rPr>
       <w:rFonts w:eastAsiaTheme="majorEastAsia" w:cstheme="majorBidi"/>
       <w:color w:val="0F4761" w:themeColor="accent1" w:themeShade="BF"/>
@@ -1088,7 +1539,7 @@
     <w:link w:val="Ttulo4"/>
     <w:uiPriority w:val="9"/>
     <w:semiHidden/>
-    <w:rsid w:val="009B0A14"/>
+    <w:rsid w:val="0043036E"/>
     <w:rPr>
       <w:rFonts w:eastAsiaTheme="majorEastAsia" w:cstheme="majorBidi"/>
       <w:i/>
@@ -1102,7 +1553,7 @@
     <w:link w:val="Ttulo5"/>
     <w:uiPriority w:val="9"/>
     <w:semiHidden/>
-    <w:rsid w:val="009B0A14"/>
+    <w:rsid w:val="0043036E"/>
     <w:rPr>
       <w:rFonts w:eastAsiaTheme="majorEastAsia" w:cstheme="majorBidi"/>
       <w:color w:val="0F4761" w:themeColor="accent1" w:themeShade="BF"/>
@@ -1114,7 +1565,7 @@
     <w:link w:val="Ttulo6"/>
     <w:uiPriority w:val="9"/>
     <w:semiHidden/>
-    <w:rsid w:val="009B0A14"/>
+    <w:rsid w:val="0043036E"/>
     <w:rPr>
       <w:rFonts w:eastAsiaTheme="majorEastAsia" w:cstheme="majorBidi"/>
       <w:i/>
@@ -1128,7 +1579,7 @@
     <w:link w:val="Ttulo7"/>
     <w:uiPriority w:val="9"/>
     <w:semiHidden/>
-    <w:rsid w:val="009B0A14"/>
+    <w:rsid w:val="0043036E"/>
     <w:rPr>
       <w:rFonts w:eastAsiaTheme="majorEastAsia" w:cstheme="majorBidi"/>
       <w:color w:val="595959" w:themeColor="text1" w:themeTint="A6"/>
@@ -1140,7 +1591,7 @@
     <w:link w:val="Ttulo8"/>
     <w:uiPriority w:val="9"/>
     <w:semiHidden/>
-    <w:rsid w:val="009B0A14"/>
+    <w:rsid w:val="0043036E"/>
     <w:rPr>
       <w:rFonts w:eastAsiaTheme="majorEastAsia" w:cstheme="majorBidi"/>
       <w:i/>
@@ -1154,7 +1605,7 @@
     <w:link w:val="Ttulo9"/>
     <w:uiPriority w:val="9"/>
     <w:semiHidden/>
-    <w:rsid w:val="009B0A14"/>
+    <w:rsid w:val="0043036E"/>
     <w:rPr>
       <w:rFonts w:eastAsiaTheme="majorEastAsia" w:cstheme="majorBidi"/>
       <w:color w:val="272727" w:themeColor="text1" w:themeTint="D8"/>
@@ -1167,9 +1618,8 @@
     <w:link w:val="TtuloCar"/>
     <w:uiPriority w:val="10"/>
     <w:qFormat/>
-    <w:rsid w:val="009B0A14"/>
+    <w:rsid w:val="0043036E"/>
     <w:pPr>
-      <w:suppressAutoHyphens w:val="0"/>
       <w:spacing w:after="80" w:line="240" w:lineRule="auto"/>
       <w:contextualSpacing/>
     </w:pPr>
@@ -1179,8 +1629,6 @@
       <w:kern w:val="28"/>
       <w:sz w:val="56"/>
       <w:szCs w:val="56"/>
-      <w:lang w:val="es-ES"/>
-      <w14:ligatures w14:val="standardContextual"/>
     </w:rPr>
   </w:style>
   <w:style w:type="character" w:customStyle="1" w:styleId="TtuloCar">
@@ -1188,7 +1636,7 @@
     <w:basedOn w:val="Fuentedeprrafopredeter"/>
     <w:link w:val="Ttulo"/>
     <w:uiPriority w:val="10"/>
-    <w:rsid w:val="009B0A14"/>
+    <w:rsid w:val="0043036E"/>
     <w:rPr>
       <w:rFonts w:asciiTheme="majorHAnsi" w:eastAsiaTheme="majorEastAsia" w:hAnsiTheme="majorHAnsi" w:cstheme="majorBidi"/>
       <w:spacing w:val="-10"/>
@@ -1204,23 +1652,18 @@
     <w:link w:val="SubttuloCar"/>
     <w:uiPriority w:val="11"/>
     <w:qFormat/>
-    <w:rsid w:val="009B0A14"/>
+    <w:rsid w:val="0043036E"/>
     <w:pPr>
       <w:numPr>
         <w:ilvl w:val="1"/>
       </w:numPr>
-      <w:suppressAutoHyphens w:val="0"/>
-      <w:spacing w:after="160" w:line="259" w:lineRule="auto"/>
     </w:pPr>
     <w:rPr>
-      <w:rFonts w:asciiTheme="minorHAnsi" w:eastAsiaTheme="majorEastAsia" w:hAnsiTheme="minorHAnsi" w:cstheme="majorBidi"/>
+      <w:rFonts w:eastAsiaTheme="majorEastAsia" w:cstheme="majorBidi"/>
       <w:color w:val="595959" w:themeColor="text1" w:themeTint="A6"/>
       <w:spacing w:val="15"/>
-      <w:kern w:val="2"/>
       <w:sz w:val="28"/>
       <w:szCs w:val="28"/>
-      <w:lang w:val="es-ES"/>
-      <w14:ligatures w14:val="standardContextual"/>
     </w:rPr>
   </w:style>
   <w:style w:type="character" w:customStyle="1" w:styleId="SubttuloCar">
@@ -1228,7 +1671,7 @@
     <w:basedOn w:val="Fuentedeprrafopredeter"/>
     <w:link w:val="Subttulo"/>
     <w:uiPriority w:val="11"/>
-    <w:rsid w:val="009B0A14"/>
+    <w:rsid w:val="0043036E"/>
     <w:rPr>
       <w:rFonts w:eastAsiaTheme="majorEastAsia" w:cstheme="majorBidi"/>
       <w:color w:val="595959" w:themeColor="text1" w:themeTint="A6"/>
@@ -1244,21 +1687,15 @@
     <w:link w:val="CitaCar"/>
     <w:uiPriority w:val="29"/>
     <w:qFormat/>
-    <w:rsid w:val="009B0A14"/>
+    <w:rsid w:val="0043036E"/>
     <w:pPr>
-      <w:suppressAutoHyphens w:val="0"/>
-      <w:spacing w:before="160" w:after="160" w:line="259" w:lineRule="auto"/>
+      <w:spacing w:before="160"/>
       <w:jc w:val="center"/>
     </w:pPr>
     <w:rPr>
-      <w:rFonts w:asciiTheme="minorHAnsi" w:eastAsiaTheme="minorHAnsi" w:hAnsiTheme="minorHAnsi"/>
       <w:i/>
       <w:iCs/>
       <w:color w:val="404040" w:themeColor="text1" w:themeTint="BF"/>
-      <w:kern w:val="2"/>
-      <w:sz w:val="22"/>
-      <w:lang w:val="es-ES"/>
-      <w14:ligatures w14:val="standardContextual"/>
     </w:rPr>
   </w:style>
   <w:style w:type="character" w:customStyle="1" w:styleId="CitaCar">
@@ -1266,7 +1703,7 @@
     <w:basedOn w:val="Fuentedeprrafopredeter"/>
     <w:link w:val="Cita"/>
     <w:uiPriority w:val="29"/>
-    <w:rsid w:val="009B0A14"/>
+    <w:rsid w:val="0043036E"/>
     <w:rPr>
       <w:i/>
       <w:iCs/>
@@ -1278,27 +1715,18 @@
     <w:basedOn w:val="Normal"/>
     <w:uiPriority w:val="34"/>
     <w:qFormat/>
-    <w:rsid w:val="009B0A14"/>
+    <w:rsid w:val="0043036E"/>
     <w:pPr>
-      <w:suppressAutoHyphens w:val="0"/>
-      <w:spacing w:after="160" w:line="259" w:lineRule="auto"/>
       <w:ind w:left="720"/>
       <w:contextualSpacing/>
     </w:pPr>
-    <w:rPr>
-      <w:rFonts w:asciiTheme="minorHAnsi" w:eastAsiaTheme="minorHAnsi" w:hAnsiTheme="minorHAnsi"/>
-      <w:kern w:val="2"/>
-      <w:sz w:val="22"/>
-      <w:lang w:val="es-ES"/>
-      <w14:ligatures w14:val="standardContextual"/>
-    </w:rPr>
   </w:style>
   <w:style w:type="character" w:styleId="nfasisintenso">
     <w:name w:val="Intense Emphasis"/>
     <w:basedOn w:val="Fuentedeprrafopredeter"/>
     <w:uiPriority w:val="21"/>
     <w:qFormat/>
-    <w:rsid w:val="009B0A14"/>
+    <w:rsid w:val="0043036E"/>
     <w:rPr>
       <w:i/>
       <w:iCs/>
@@ -1312,26 +1740,20 @@
     <w:link w:val="CitadestacadaCar"/>
     <w:uiPriority w:val="30"/>
     <w:qFormat/>
-    <w:rsid w:val="009B0A14"/>
+    <w:rsid w:val="0043036E"/>
     <w:pPr>
       <w:pBdr>
         <w:top w:val="single" w:sz="4" w:space="10" w:color="0F4761" w:themeColor="accent1" w:themeShade="BF"/>
         <w:bottom w:val="single" w:sz="4" w:space="10" w:color="0F4761" w:themeColor="accent1" w:themeShade="BF"/>
       </w:pBdr>
-      <w:suppressAutoHyphens w:val="0"/>
-      <w:spacing w:before="360" w:after="360" w:line="259" w:lineRule="auto"/>
+      <w:spacing w:before="360" w:after="360"/>
       <w:ind w:left="864" w:right="864"/>
       <w:jc w:val="center"/>
     </w:pPr>
     <w:rPr>
-      <w:rFonts w:asciiTheme="minorHAnsi" w:eastAsiaTheme="minorHAnsi" w:hAnsiTheme="minorHAnsi"/>
       <w:i/>
       <w:iCs/>
       <w:color w:val="0F4761" w:themeColor="accent1" w:themeShade="BF"/>
-      <w:kern w:val="2"/>
-      <w:sz w:val="22"/>
-      <w:lang w:val="es-ES"/>
-      <w14:ligatures w14:val="standardContextual"/>
     </w:rPr>
   </w:style>
   <w:style w:type="character" w:customStyle="1" w:styleId="CitadestacadaCar">
@@ -1339,7 +1761,7 @@
     <w:basedOn w:val="Fuentedeprrafopredeter"/>
     <w:link w:val="Citadestacada"/>
     <w:uiPriority w:val="30"/>
-    <w:rsid w:val="009B0A14"/>
+    <w:rsid w:val="0043036E"/>
     <w:rPr>
       <w:i/>
       <w:iCs/>
@@ -1351,7 +1773,7 @@
     <w:basedOn w:val="Fuentedeprrafopredeter"/>
     <w:uiPriority w:val="32"/>
     <w:qFormat/>
-    <w:rsid w:val="009B0A14"/>
+    <w:rsid w:val="0043036E"/>
     <w:rPr>
       <w:b/>
       <w:bCs/>
@@ -1359,6 +1781,198 @@
       <w:color w:val="0F4761" w:themeColor="accent1" w:themeShade="BF"/>
       <w:spacing w:val="5"/>
     </w:rPr>
+  </w:style>
+  <w:style w:type="paragraph" w:customStyle="1" w:styleId="CodeBlock">
+    <w:name w:val="CodeBlock"/>
+    <w:rsid w:val="0043036E"/>
+    <w:pPr>
+      <w:shd w:val="clear" w:color="auto" w:fill="F2F2F2"/>
+      <w:spacing w:after="200" w:line="276" w:lineRule="auto"/>
+    </w:pPr>
+    <w:rPr>
+      <w:rFonts w:ascii="Courier New" w:eastAsia="Courier New" w:hAnsi="Courier New"/>
+      <w:kern w:val="0"/>
+      <w:sz w:val="17"/>
+      <w:lang w:val="en-US"/>
+      <w14:ligatures w14:val="none"/>
+    </w:rPr>
+  </w:style>
+  <w:style w:type="table" w:styleId="Tablanormal5">
+    <w:name w:val="Plain Table 5"/>
+    <w:basedOn w:val="Tablanormal"/>
+    <w:uiPriority w:val="45"/>
+    <w:rsid w:val="0043036E"/>
+    <w:pPr>
+      <w:spacing w:after="0" w:line="240" w:lineRule="auto"/>
+    </w:pPr>
+    <w:tblPr>
+      <w:tblStyleRowBandSize w:val="1"/>
+      <w:tblStyleColBandSize w:val="1"/>
+    </w:tblPr>
+    <w:tblStylePr w:type="firstRow">
+      <w:rPr>
+        <w:rFonts w:asciiTheme="majorHAnsi" w:eastAsiaTheme="majorEastAsia" w:hAnsiTheme="majorHAnsi" w:cstheme="majorBidi"/>
+        <w:i/>
+        <w:iCs/>
+        <w:sz w:val="26"/>
+      </w:rPr>
+      <w:tblPr/>
+      <w:tcPr>
+        <w:tcBorders>
+          <w:bottom w:val="single" w:sz="4" w:space="0" w:color="7F7F7F" w:themeColor="text1" w:themeTint="80"/>
+        </w:tcBorders>
+        <w:shd w:val="clear" w:color="auto" w:fill="FFFFFF" w:themeFill="background1"/>
+      </w:tcPr>
+    </w:tblStylePr>
+    <w:tblStylePr w:type="lastRow">
+      <w:rPr>
+        <w:rFonts w:asciiTheme="majorHAnsi" w:eastAsiaTheme="majorEastAsia" w:hAnsiTheme="majorHAnsi" w:cstheme="majorBidi"/>
+        <w:i/>
+        <w:iCs/>
+        <w:sz w:val="26"/>
+      </w:rPr>
+      <w:tblPr/>
+      <w:tcPr>
+        <w:tcBorders>
+          <w:top w:val="single" w:sz="4" w:space="0" w:color="7F7F7F" w:themeColor="text1" w:themeTint="80"/>
+        </w:tcBorders>
+        <w:shd w:val="clear" w:color="auto" w:fill="FFFFFF" w:themeFill="background1"/>
+      </w:tcPr>
+    </w:tblStylePr>
+    <w:tblStylePr w:type="firstCol">
+      <w:pPr>
+        <w:jc w:val="right"/>
+      </w:pPr>
+      <w:rPr>
+        <w:rFonts w:asciiTheme="majorHAnsi" w:eastAsiaTheme="majorEastAsia" w:hAnsiTheme="majorHAnsi" w:cstheme="majorBidi"/>
+        <w:i/>
+        <w:iCs/>
+        <w:sz w:val="26"/>
+      </w:rPr>
+      <w:tblPr/>
+      <w:tcPr>
+        <w:tcBorders>
+          <w:right w:val="single" w:sz="4" w:space="0" w:color="7F7F7F" w:themeColor="text1" w:themeTint="80"/>
+        </w:tcBorders>
+        <w:shd w:val="clear" w:color="auto" w:fill="FFFFFF" w:themeFill="background1"/>
+      </w:tcPr>
+    </w:tblStylePr>
+    <w:tblStylePr w:type="lastCol">
+      <w:rPr>
+        <w:rFonts w:asciiTheme="majorHAnsi" w:eastAsiaTheme="majorEastAsia" w:hAnsiTheme="majorHAnsi" w:cstheme="majorBidi"/>
+        <w:i/>
+        <w:iCs/>
+        <w:sz w:val="26"/>
+      </w:rPr>
+      <w:tblPr/>
+      <w:tcPr>
+        <w:tcBorders>
+          <w:left w:val="single" w:sz="4" w:space="0" w:color="7F7F7F" w:themeColor="text1" w:themeTint="80"/>
+        </w:tcBorders>
+        <w:shd w:val="clear" w:color="auto" w:fill="FFFFFF" w:themeFill="background1"/>
+      </w:tcPr>
+    </w:tblStylePr>
+    <w:tblStylePr w:type="band1Vert">
+      <w:tblPr/>
+      <w:tcPr>
+        <w:shd w:val="clear" w:color="auto" w:fill="F2F2F2" w:themeFill="background1" w:themeFillShade="F2"/>
+      </w:tcPr>
+    </w:tblStylePr>
+    <w:tblStylePr w:type="band1Horz">
+      <w:tblPr/>
+      <w:tcPr>
+        <w:shd w:val="clear" w:color="auto" w:fill="F2F2F2" w:themeFill="background1" w:themeFillShade="F2"/>
+      </w:tcPr>
+    </w:tblStylePr>
+    <w:tblStylePr w:type="neCell">
+      <w:tblPr/>
+      <w:tcPr>
+        <w:tcBorders>
+          <w:left w:val="nil"/>
+        </w:tcBorders>
+      </w:tcPr>
+    </w:tblStylePr>
+    <w:tblStylePr w:type="nwCell">
+      <w:tblPr/>
+      <w:tcPr>
+        <w:tcBorders>
+          <w:right w:val="nil"/>
+        </w:tcBorders>
+      </w:tcPr>
+    </w:tblStylePr>
+    <w:tblStylePr w:type="seCell">
+      <w:tblPr/>
+      <w:tcPr>
+        <w:tcBorders>
+          <w:left w:val="nil"/>
+        </w:tcBorders>
+      </w:tcPr>
+    </w:tblStylePr>
+    <w:tblStylePr w:type="swCell">
+      <w:tblPr/>
+      <w:tcPr>
+        <w:tcBorders>
+          <w:right w:val="nil"/>
+        </w:tcBorders>
+      </w:tcPr>
+    </w:tblStylePr>
+  </w:style>
+  <w:style w:type="table" w:styleId="Tablaconcuadrcula1clara">
+    <w:name w:val="Grid Table 1 Light"/>
+    <w:basedOn w:val="Tablanormal"/>
+    <w:uiPriority w:val="46"/>
+    <w:rsid w:val="0043036E"/>
+    <w:pPr>
+      <w:spacing w:after="0" w:line="240" w:lineRule="auto"/>
+    </w:pPr>
+    <w:tblPr>
+      <w:tblStyleRowBandSize w:val="1"/>
+      <w:tblStyleColBandSize w:val="1"/>
+      <w:tblBorders>
+        <w:top w:val="single" w:sz="4" w:space="0" w:color="999999" w:themeColor="text1" w:themeTint="66"/>
+        <w:left w:val="single" w:sz="4" w:space="0" w:color="999999" w:themeColor="text1" w:themeTint="66"/>
+        <w:bottom w:val="single" w:sz="4" w:space="0" w:color="999999" w:themeColor="text1" w:themeTint="66"/>
+        <w:right w:val="single" w:sz="4" w:space="0" w:color="999999" w:themeColor="text1" w:themeTint="66"/>
+        <w:insideH w:val="single" w:sz="4" w:space="0" w:color="999999" w:themeColor="text1" w:themeTint="66"/>
+        <w:insideV w:val="single" w:sz="4" w:space="0" w:color="999999" w:themeColor="text1" w:themeTint="66"/>
+      </w:tblBorders>
+    </w:tblPr>
+    <w:tblStylePr w:type="firstRow">
+      <w:rPr>
+        <w:b/>
+        <w:bCs/>
+      </w:rPr>
+      <w:tblPr/>
+      <w:tcPr>
+        <w:tcBorders>
+          <w:bottom w:val="single" w:sz="12" w:space="0" w:color="666666" w:themeColor="text1" w:themeTint="99"/>
+        </w:tcBorders>
+      </w:tcPr>
+    </w:tblStylePr>
+    <w:tblStylePr w:type="lastRow">
+      <w:rPr>
+        <w:b/>
+        <w:bCs/>
+      </w:rPr>
+      <w:tblPr/>
+      <w:tcPr>
+        <w:tcBorders>
+          <w:top w:val="double" w:sz="2" w:space="0" w:color="666666" w:themeColor="text1" w:themeTint="99"/>
+        </w:tcBorders>
+      </w:tcPr>
+    </w:tblStylePr>
+    <w:tblStylePr w:type="firstCol">
+      <w:rPr>
+        <w:b/>
+        <w:bCs/>
+      </w:rPr>
+    </w:tblStylePr>
+    <w:tblStylePr w:type="lastCol">
+      <w:rPr>
+        <w:b/>
+        <w:bCs/>
+      </w:rPr>
+    </w:tblStylePr>
   </w:style>
 </w:styles>
 </file>

</xml_diff>